<commit_message>
illappct: amicus, answering, opening, reply briefs regenerated on the model at HEAD; answering and reply gated, amicus latex gated (docx Word footnote area reported), opening latex (footnote lost in a pilcrow token's mbox) and docx (LibreOffice note placement) reported (fb-595.54.56)
Co-Authored-By: Claude Opus 5.5 <noreply@anthropic.com>
</commit_message>
<xml_diff>
--- a/courts/seventh-circuit/illinois/state/appellate-court/amicus-brief/usage/OUTPUT-amicus-brief.docx
+++ b/courts/seventh-circuit/illinois/state/appellate-court/amicus-brief/usage/OUTPUT-amicus-brief.docx
@@ -1977,7 +1977,7 @@
         <w:tab/>
       </w:r>
       <w:r>
-        <w:t xml:space="preserve">8</w:t>
+        <w:t xml:space="preserve">10</w:t>
       </w:r>
     </w:p>
     <w:p>
@@ -3231,19 +3231,7 @@
         <w:noBreakHyphen/>
       </w:r>
       <w:r>
-        <w:t xml:space="preserve">0384 (2015) and its resulting amendments to the Illinois Code of Civil Procedure § 2</w:t>
-      </w:r>
-      <w:r>
-        <w:noBreakHyphen/>
-      </w:r>
-      <w:r>
-        <w:t xml:space="preserve">1401(b</w:t>
-      </w:r>
-      <w:r>
-        <w:noBreakHyphen/>
-      </w:r>
-      <w:r>
-        <w:t xml:space="preserve">5) (“Section (b</w:t>
+        <w:t xml:space="preserve">0384 (2015) and its resulting amendments to the Illinois Code of Civil Procedure § 2-⁠1401(b-⁠5) (“Section (b</w:t>
       </w:r>
       <w:r>
         <w:noBreakHyphen/>
@@ -3645,7 +3633,7 @@
         <w:pStyle w:val="BodyText"/>
       </w:pPr>
       <w:r>
-        <w:t xml:space="preserve">Intimate partner violence affects people of all backgrounds, regardless of socioeconomic status and education; occurs within married, cohabitating, and dating couples; and infects heterosexual and LGBTQ relationships alike. Dep’t of Just., OJP Fact Sheet: Domestic Violence (Nov. 2011), https://bit.ly/3w9bnd7 (“Fact Sheet”). Each year, intimate partners rape or physically assault women in the United States nearly five million times. Id. At least one out of every three female murder victims is killed by her husband or boyfriend. Off. for Victims of Crime Training &amp; Tech. Assistance Ctr., Intimate Partner Violence, https://bit.ly/2QOnnAO (“OVC”).</w:t>
+        <w:t xml:space="preserve">Intimate partner violence affects people of all backgrounds, regardless of socioeconomic status and education; occurs within married, cohabitating, and dating couples; and infects heterosexual and LGBTQ relationships alike. Dep’t of Just., OJP Fact Sheet: Domestic Violence (Nov. 2011), https://​bit.​ly/​3w9bnd7 (“Fact Sheet”). Each year, intimate partners rape or physically assault women in the United States nearly five million times. Id. At least one out of every three female murder victims is killed by her husband or boyfriend. Off. for Victims of Crime Training &amp; Tech. Assistance Ctr., Intimate Partner Violence, https://​bit.​ly/​2QOnnAO (“OVC”).</w:t>
       </w:r>
     </w:p>
     <w:p>
@@ -4017,7 +4005,7 @@
         <w:pStyle w:val="BodyText"/>
       </w:pPr>
       <w:r>
-        <w:t xml:space="preserve">Thus, even with the husband’s “right of chastisement” technically gone, cultural understandings held firm. “[L]egal authorities continued . . . to treat wife beating more favorably than other instances of assault and battery and remained extremely reluctant to enforce criminal or civil penalties for marital violence.” Hasday, supra, at 1390; see also Reva B. Siegel, “The Rule of Love”: Wife Beating as Prerogative and Privacy, 105 Yale L.J. 2117, 2117 (1996) (“[F]or a century after courts repudiated the right of chastisement, the American legal system continued to treat wife beating differently from other cases of assault and battery.”).</w:t>
+        <w:t xml:space="preserve">Thus, even with the husband’s “right of chastisement” technically gone, cultural understandings held firm. “[L]egal authorities continued . . . to treat wife beating more favorably than other instances of assault and battery and remained extremely reluctant to enforce criminal or civil penalties for marital violence.” Hasday, supra, at 1390; see also Reva B. Siegel, “The Rule of Love”: Wife Beating as Prerogative and Privacy, 105 Yale L.J. 2117, 2117 (1996) (“[F]or a century after courts repudiated the right of chastisement, the American legal system continued to treat wife beating differently from other cases of assault and battery.”).</w:t>
       </w:r>
     </w:p>
     <w:p>
@@ -5529,53 +5517,41 @@
         <w:noBreakHyphen/>
       </w:r>
       <w:r>
-        <w:t xml:space="preserve">322, §§ 40001</w:t>
+        <w:t xml:space="preserve">322, §§ 40001-⁠40703); United States v. Casciano, 124 F.3d 106, 110 (2d Cir. 1997) (VAWA “is a comprehensive statute designed to provide women nationwide greater protection and recourse against violence and to impose accountability on abusers.”). “Congress’s goal in enacting VAWA was to eliminate barriers to women leaving abusive relationships.” Lopez-Birrueta v. Holder, 633 F.3d 1211, 1215 (9th Cir. 2011). The passage of VAWA was both a recognition of significant change as well as an initiation of further policy shifts related to domestic violence so that the country would make progress in its treatment of domestic violence survivors. Sack, supra, 32</w:t>
       </w:r>
       <w:r>
         <w:noBreakHyphen/>
       </w:r>
       <w:r>
-        <w:t xml:space="preserve">40703); United States v. Casciano, 124 F.3d 106, 110 (2d Cir. 1997) (VAWA “is a comprehensive statute designed to provide women nationwide greater protection and recourse against violence and to impose accountability on abusers.”). “Congress’s goal in enacting VAWA was to eliminate barriers to women leaving abusive relationships.” Lopez-Birrueta v. Holder, 633 F.3d 1211, 1215 (9th Cir. 2011). The passage of VAWA was both a recognition of significant change as well as an initiation of further policy shifts related to domestic violence so that the country would make progress in its treatment of domestic violence survivors. Sack, supra, 32</w:t>
+        <w:t xml:space="preserve">36. Perhaps VAWA’s most important innovation (in theory) was that it created a private cause of action for victims of a “crime of violence motivated by gender” to sue the perpetrators for money damages in federal court (i.e. the “civil rights provision”). Caroline S. Schmidt, What Killed the Violence Against Women Act’s Civil Rights Remedy Before the Supreme Court Did?, 101 Va. L. Rev. 501, 502</w:t>
       </w:r>
       <w:r>
         <w:noBreakHyphen/>
       </w:r>
       <w:r>
-        <w:t xml:space="preserve">36. Perhaps VAWA’s most important innovation (in theory) was that it created a private cause of action for victims of a “crime of violence motivated by gender” to sue the perpetrators for money damages in federal court (i.e. the “civil rights provision”). Caroline S. Schmidt, What Killed the Violence Against Women Act’s Civil Rights Remedy Before the Supreme Court Did?, 101 Va. L. Rev. 501, 502</w:t>
+        <w:t xml:space="preserve">03 (2015).</w:t>
+      </w:r>
+    </w:p>
+    <w:p>
+      <w:pPr>
+        <w:pStyle w:val="BodyText"/>
+      </w:pPr>
+      <w:r>
+        <w:t xml:space="preserve">VAWA’s enactment occurred against a backdrop of vigorous opposition by federal and state judges, who objected that it would bring “private” matters into federal court. Sally F. Goldfarb, Violence Against Women and the Persistence of Privacy, 61 Ohio St. L.J. 1, 1 (2000). In fact, “[m]uch of the opposition to the civil rights provision took the form of assertions that federal courts should not interfere in the private, domestic sphere.” Goldfarb, supra, at 52. For example, “[i]n a particularly striking evocation of the ideology of legal nonintervention in the family, the Conference of Chief Justices, which represents the state judiciary, criticized VAWA’s civil rights provision on the ground that it would conflict with the marital rape exemption.” Id. “Similarly, lawyer Bruce Fein, who testified against the legislation, specifically objected to the fact that VAWA would interfere with a state’s choice not to criminalize spousal rape—a choice that, according to Fein, states should be free to make based on ‘local customs.’” Goldfarb, supra, at 52.</w:t>
+      </w:r>
+    </w:p>
+    <w:p>
+      <w:pPr>
+        <w:pStyle w:val="BodyText"/>
+      </w:pPr>
+      <w:r>
+        <w:t xml:space="preserve">However, VAWA “in general, and the civil rights provision in particular, [was] designed to counteract the view . . . that domestic violence (and by extension, other forms of violence against women) are ‘private’ and therefore do not deserve legal redress.” Goldfarb, supra, at 46. During the hearings preceding VAWA’s passage, “[a] great deal of emphasis was placed on state judicial systems’ failure to adequately address violence against women.” Schmidt, supra, at 521; see also Sally F. Goldfarb, “No Civilized System of Justice”: The Fate of the Violence Against Women, 102 W.Va. L. Rev. 499, 507 (2000) (“Congress found that state laws were inadequate to redress violence against women.”). Thus, “VAWA provides extensive federal funding . . . to the States to help them curtail violence against women through law enforcement efforts, education and prevention programs, and the maintenance of battered women’s shelters.” Brzonkala, 169 F.3d at 827 (citing 42 U.S.C. §§ 3796gg, 300w</w:t>
       </w:r>
       <w:r>
         <w:noBreakHyphen/>
       </w:r>
       <w:r>
-        <w:t xml:space="preserve">03 (2015).</w:t>
-      </w:r>
-    </w:p>
-    <w:p>
-      <w:pPr>
-        <w:pStyle w:val="BodyText"/>
-      </w:pPr>
-      <w:r>
-        <w:t xml:space="preserve">VAWA’s enactment occurred against a backdrop of vigorous opposition by federal and state judges, who objected that it would bring “private” matters into federal court. Sally F. Goldfarb, Violence Against Women and the Persistence of Privacy, 61 Ohio St. L.J. 1, 1 (2000). In fact, “[m]uch of the opposition to the civil rights provision took the form of assertions that federal courts should not interfere in the private, domestic sphere.” Goldfarb, supra, at 52. For example, “[i]n a particularly striking evocation of the ideology of legal nonintervention in the family, the Conference of Chief Justices, which represents the state judiciary, criticized VAWA’s civil rights provision on the ground that it would conflict with the marital rape exemption.” Id. “Similarly, lawyer Bruce Fein, who testified against the legislation, specifically objected to the fact that VAWA would interfere with a state’s choice not to criminalize spousal rape—a choice that, according to Fein, states should be free to make based on ‘local customs.’” Goldfarb, supra, at 52.</w:t>
-      </w:r>
-    </w:p>
-    <w:p>
-      <w:pPr>
-        <w:pStyle w:val="BodyText"/>
-      </w:pPr>
-      <w:r>
-        <w:t xml:space="preserve">However, VAWA “in general, and the civil rights provision in particular, [was] designed to counteract the view . . . that domestic violence (and by extension, other forms of violence against women) are ‘private’ and therefore do not deserve legal redress.” Goldfarb, supra, at 46. During the hearings preceding VAWA’s passage, “[a] great deal of emphasis was placed on state judicial systems’ failure to adequately address violence against women.” Schmidt, supra, at 521; see also Sally F. Goldfarb, “No Civilized System of Justice”: The Fate of the Violence Against Women, 102 W.Va. L. Rev. 499, 507 (2000) (“Congress found that state laws were inadequate to redress violence against women.”). Thus, “VAWA provides extensive federal funding . . . to the States to help them curtail violence against women through law enforcement efforts, education and prevention programs, and the maintenance of battered women’s shelters.” Brzonkala, 169 F.3d at 827 (citing 42 U.S.C. §§ 3796gg, 300w</w:t>
-      </w:r>
-      <w:r>
-        <w:noBreakHyphen/>
-      </w:r>
-      <w:r>
-        <w:t xml:space="preserve">10, 10402). Furthermore, “it criminalizes interstate acts of domestic violence, as well as the interstate violation of protective orders against violence and harassment,” “imposes various sentencing enhancements for existing federal crimes motivated by gender animus,” provides “restitution to the victims of violent crime against women,” and “amends the Federal Rules of Evidence by adopting a rape shield provision to exclude from sexual assault trials evidence of a victim’s prior sexual behavior.” Id. (citing 18 U.S.C. §§ 2247</w:t>
-      </w:r>
-      <w:r>
-        <w:noBreakHyphen/>
-      </w:r>
-      <w:r>
-        <w:t xml:space="preserve">48, 2259, 2261</w:t>
+        <w:t xml:space="preserve">10, 10402). Furthermore, “it criminalizes interstate acts of domestic violence, as well as the interstate violation of protective orders against violence and harassment,” “imposes various sentencing enhancements for existing federal crimes motivated by gender animus,” provides “restitution to the victims of violent crime against women,” and “amends the Federal Rules of Evidence by adopting a rape shield provision to exclude from sexual assault trials evidence of a victim’s prior sexual behavior.” Id. (citing 18 U.S.C. §§ 2247-⁠48, 2259, 2261</w:t>
       </w:r>
       <w:r>
         <w:noBreakHyphen/>
@@ -5717,7 +5693,7 @@
         <w:pStyle w:val="BodyText"/>
       </w:pPr>
       <w:r>
-        <w:t xml:space="preserve">The IDVA states that it “shall be liberally construed and applied to promote its underlying purposes,” which include to “[r]ecognize domestic violence as a serious crime against the individual and society” and “that the legal system has ineffectively dealt with family violence in the past.” 750 ILCS 60/102(1), (3); see also In re Marriage of Young, 2013 IL App (2d) 121196, ¶ 20 (“The Act is to be construed liberally to promote its purposes, which include supporting the victims of domestic violence to avoid further abuse and ‘reduce the abuser’s access to the victim . . . so that victims are not trapped in abusive situations . . . .’”). The IDVA likewise recognized that “although many laws have changed, in practice there is still widespread failure to appropriately protect and assist victims.” 750 ILCS 60/102(3).</w:t>
+        <w:t xml:space="preserve">The IDVA states that it “shall be liberally construed and applied to promote its underlying purposes,” which include to “[r]ecognize domestic violence as a serious crime against the individual and society” and “that the legal system has ineffectively dealt with family violence in the past.” 750 ILCS 60/102(1), (3); see also In re Marriage of Young, 2013 IL App (2d) 121196, ¶ 20 (“The Act is to be construed liberally to promote its purposes, which include supporting the victims of domestic violence to avoid further abuse and ‘reduce the abuser’s access to the victim . . . so that victims are not trapped in abusive situations . . . .’”). The IDVA likewise recognized that “although many laws have changed, in practice there is still widespread failure to appropriately protect and assist victims.” 750 ILCS 60/102(3).</w:t>
       </w:r>
     </w:p>
     <w:p>
@@ -5889,7 +5865,7 @@
         <w:noBreakHyphen/>
       </w:r>
       <w:r>
-        <w:t xml:space="preserve">958—co-sponsored by then-state senator Barack Obama. And even today, “[t]he ambivalence of public attitudes toward martial rape is evident in . . . the lack of prosecution and even lower conviction rates” in domestic rape cases. Sack, supra, at 52.</w:t>
+        <w:t xml:space="preserve">958—co-sponsored by then-state senator Barack Obama. And even today, “[t]he ambivalence of public attitudes toward martial rape is evident in . . . the lack of prosecution and even lower conviction rates” in domestic rape cases. Sack, supra, at 52.</w:t>
       </w:r>
     </w:p>
     <w:p>
@@ -6137,7 +6113,7 @@
         <w:noBreakHyphen/>
       </w:r>
       <w:r>
-        <w:t xml:space="preserve">14.2 (first offender; felony prostitution) . . . or a similar local ordinance,” which the court “may grant . . . if, in the discretion of the court, the violation was a result of the defendant having been a victim of human trafficking.” 725 ILCS 5/116</w:t>
+        <w:t xml:space="preserve">14.2 (first offender; felony prostitution) . . . or a similar local ordinance,” which the court “may grant . . . if, in the discretion of the court, the violation was a result of the defendant having been a victim of human trafficking.” 725 ILCS 5/116</w:t>
       </w:r>
       <w:r>
         <w:noBreakHyphen/>
@@ -6459,7 +6435,7 @@
         <w:pStyle w:val="BodyText"/>
       </w:pPr>
       <w:r>
-        <w:t xml:space="preserve">For example, just six years after the passage of VAWA the U.S. Supreme Court found the law’s critical private-remedy “civil rights provision” unconstitutional for exceeding Congress’ legislative authority. See United States v. Morrison, 529 U.S. 598 (2000). “Within the subtext of the opinion [in Morrison] . . . lies a systematic refutation of the existence and validity of the idea of violence against women.” Jill Laurie Goodman, The Idea of Violence Against Women: Lessons from United States v. Jessica Lenahan, The Federal Civil Rights Remedy, and the New York State Anti-Trafficking Campaign, 36 N.Y.U. Rev. L. &amp; Soc. Change 593, 621 (2012). Despite years of scientific research showing the unique and lasting trauma that intimate partner violence inflicts on women, Morrison “repeatedly characterized the acts of violence covered by the Civil Rights Remedy as no different from other violent felonies.” Id.</w:t>
+        <w:t xml:space="preserve">For example, just six years after the passage of VAWA the U.S. Supreme Court found the law’s critical private-remedy “civil rights provision” unconstitutional for exceeding Congress’ legislative authority. See United States v. Morrison, 529 U.S. 598 (2000). “Within the subtext of the opinion [in Morrison] . . . lies a systematic refutation of the existence and validity of the idea of violence against women.” Jill Laurie Goodman, The Idea of Violence Against Women: Lessons from United States v. Jessica Lenahan, The Federal Civil Rights Remedy, and the New York State Anti-Trafficking Campaign, 36 N.Y.U. Rev. L. &amp; Soc. Change 593, 621 (2012). Despite years of scientific research showing the unique and lasting trauma that intimate partner violence inflicts on women, Morrison “repeatedly characterized the acts of violence covered by the Civil Rights Remedy as no different from other violent felonies.” Id.</w:t>
       </w:r>
     </w:p>
     <w:p>
@@ -6893,7 +6869,7 @@
         <w:noBreakHyphen/>
       </w:r>
       <w:r>
-        <w:t xml:space="preserve">588; see Jackson, supra, at 74 (“the more a woman is raped by her husband, the more she experiences feelings of self-blame rather than feelings of anger directed at her husband.”). At no point in her sentencing hearing did she seek leniency based on her husband’s abuses. See Erez, supra (“Research . . . suggests that when battered women first approach the justice system they tend to underplay the extent of their injuries, feel shame and guilt about their victimization, and are very hesitant to mobilize the system for their protection.”). Ms. Bowers remains in prison with no possibility of parole, while one of the men who actually bludgeoned her husband to death has since gone free. Cf. Sack, supra, at 44</w:t>
+        <w:t xml:space="preserve">588; see Jackson, supra, at 74 (“the more a woman is raped by her husband, the more she experiences feelings of self-blame rather than feelings of anger directed at her husband.”). At no point in her sentencing hearing did she seek leniency based on her husband’s abuses. See Erez, supra (“Research . . . suggests that when battered women first approach the justice system they tend to underplay the extent of their injuries, feel shame and guilt about their victimization, and are very hesitant to mobilize the system for their protection.”). Ms. Bowers remains in prison with no possibility of parole, while one of the men who actually bludgeoned her husband to death has since gone free. Cf. Sack, supra, at 44</w:t>
       </w:r>
       <w:r>
         <w:noBreakHyphen/>
@@ -6931,7 +6907,7 @@
         <w:noBreakHyphen/>
       </w:r>
       <w:r>
-        <w:t xml:space="preserve">5) is aimed at overturning the legacy of centuries of acquiescence in the abuse of women. And it would be manifestly unjust to shut the courthouse doors to Ms. Bowers, because she is no less deserving of the opportunity to present this mitigating evidence than a woman sentenced in 2014. If anything, she and others like her are even more deserving of that opportunity, having already served years (or even decades) of criminal sentences that Illinois lawmakers have since unanimously recognized are too harsh. See Senate Vote, S.B. 209, 99th Gen. Assembly (Apr. 30, 2015), https://bit.ly/3saPBmo (51 to 0); House Roll Call, S.B. 209, 99th Gen. Assembly (May 25, 2015), https://bit.ly/3mvTC3w (106 to 0).</w:t>
+        <w:t xml:space="preserve">5) is aimed at overturning the legacy of centuries of acquiescence in the abuse of women. And it would be manifestly unjust to shut the courthouse doors to Ms. Bowers, because she is no less deserving of the opportunity to present this mitigating evidence than a woman sentenced in 2014. If anything, she and others like her are even more deserving of that opportunity, having already served years (or even decades) of criminal sentences that Illinois lawmakers have since unanimously recognized are too harsh. See Senate Vote, S.B. 209, 99th Gen. Assembly (Apr. 30, 2015), https://​bit.​ly/​3saPBmo (51 to 0); House Roll Call, S.B. 209, 99th Gen. Assembly (May 25, 2015), https://​bit.​ly/​3mvTC3w (106 to 0).</w:t>
       </w:r>
     </w:p>
     <w:p>
@@ -9018,7 +8994,7 @@
         <w:t xml:space="preserve"> </w:t>
       </w:r>
       <w:r>
-        <w:t xml:space="preserve">Lord Hale’s infamous supposition that women “cannot retract” their marital consent to sex persists to this day. For instance, echoing Hale, a Missouri pastor’s sermon recently went viral for preaching that “[t]he wife does not have authority over her own body but yields it to her husband,’ the scripture [the pastor] referenced says. ‘After you get married, men, put this on your headboard in the house,’ [the pastor] said. ‘Whenever she’s not in the mood, take out your Bible.’” Elisha Fieldstadt, Missouri pastor on leave after sexist sermon preaching wives need to look good for their husbands, NBC News (Mar. 8, 2021), https://nbcnews.to/31sfMKc.</w:t>
+        <w:t xml:space="preserve">Lord Hale’s infamous supposition that women “cannot retract” their marital consent to sex persists to this day. For instance, echoing Hale, a Missouri pastor’s sermon recently went viral for preaching that “[t]he wife does not have authority over her own body but yields it to her husband,’ the scripture [the pastor] referenced says. ‘After you get married, men, put this on your headboard in the house,’ [the pastor] said. ‘Whenever she’s not in the mood, take out your Bible.’” Elisha Fieldstadt, Missouri pastor on leave after sexist sermon preaching wives need to look good for their husbands, NBC News (Mar. 8, 2021), https://​nbcnews.​to/​31sfMKc.</w:t>
       </w:r>
     </w:p>
   </w:footnote>
@@ -9760,6 +9736,7 @@
     <w:unhideWhenUsed/>
     <w:qFormat/>
     <w:pPr>
+      <w:keepLines/>
       <w:spacing w:before="0" w:after="140" w:line="276" w:lineRule="exact"/>
     </w:pPr>
     <w:rPr>
@@ -10010,6 +9987,33 @@
     <w:pPr>
       <w:spacing w:before="0" w:after="0" w:line="276" w:lineRule="exact"/>
       <w:ind w:left="2160" w:hanging="720"/>
+    </w:pPr>
+  </w:style>
+  <w:style w:type="paragraph" w:customStyle="1" w:styleId="XdQuoteList1">
+    <w:name w:val="Xd Quote List 1"/>
+    <w:basedOn w:val="Normal"/>
+    <w:qFormat/>
+    <w:pPr>
+      <w:spacing w:before="0" w:after="0" w:line="276" w:lineRule="exact"/>
+      <w:ind w:left="1440" w:right="720" w:hanging="720"/>
+    </w:pPr>
+  </w:style>
+  <w:style w:type="paragraph" w:customStyle="1" w:styleId="XdQuoteList2">
+    <w:name w:val="Xd Quote List 2"/>
+    <w:basedOn w:val="Normal"/>
+    <w:qFormat/>
+    <w:pPr>
+      <w:spacing w:before="0" w:after="0" w:line="276" w:lineRule="exact"/>
+      <w:ind w:left="2160" w:right="720" w:hanging="720"/>
+    </w:pPr>
+  </w:style>
+  <w:style w:type="paragraph" w:customStyle="1" w:styleId="XdQuoteList3">
+    <w:name w:val="Xd Quote List 3"/>
+    <w:basedOn w:val="Normal"/>
+    <w:qFormat/>
+    <w:pPr>
+      <w:spacing w:before="0" w:after="0" w:line="276" w:lineRule="exact"/>
+      <w:ind w:left="2880" w:right="720" w:hanging="720"/>
     </w:pPr>
   </w:style>
   <w:style w:type="paragraph" w:customStyle="1" w:styleId="XdQuoteOnly">

</xml_diff>